<commit_message>
fix: resolve PSScriptRoot empty string error in BAT in-memory execution
</commit_message>
<xml_diff>
--- a/גיבוי וורד - MechLex_Visual_Admin_Fork/core/start-local-server.ps1.docx
+++ b/גיבוי וורד - MechLex_Visual_Admin_Fork/core/start-local-server.ps1.docx
@@ -15,7 +15,11 @@
   [string]$SharedDataPath = ""
 )
 $ErrorActionPreference = "Stop"
-$Root = [System.IO.Path]::GetFullPath((Join-Path $PSScriptRoot "..")).TrimEnd([System.IO.Path]::DirectorySeparatorChar, [System.IO.Path]::AltDirectorySeparatorChar)
+if ([string]::IsNullOrEmpty($PSScriptRoot)) {
+  $Root = [System.IO.Path]::GetFullPath($PWD.Path)
+} else {
+  $Root = [System.IO.Path]::GetFullPath((Join-Path $PSScriptRoot "..")).TrimEnd([System.IO.Path]::DirectorySeparatorChar, [System.IO.Path]::AltDirectorySeparatorChar)
+}
 $RootBoundary = $Root + [System.IO.Path]::DirectorySeparatorChar
 $Address = [System.Net.IPAddress]::Loopback
 $MaxBodyBytes = 35MB

</xml_diff>